<commit_message>
Update payment workflows and dashboard summaries
</commit_message>
<xml_diff>
--- a/media/rules_templates/rules_and_regulations.docx
+++ b/media/rules_templates/rules_and_regulations.docx
@@ -96,7 +96,7 @@
                   <a:graphicData uri="http://schemas.microsoft.com/office/word/2010/wordprocessingShape">
                     <wps:wsp>
                       <wps:cNvSpPr>
-                        <a:spLocks noChangeArrowheads="1"/>
+                        <a:spLocks noChangeAspect="1" noChangeArrowheads="1"/>
                       </wps:cNvSpPr>
                       <wps:spPr bwMode="auto">
                         <a:xfrm>
@@ -135,7 +135,7 @@
           </mc:Choice>
           <mc:Fallback>
             <w:pict>
-              <v:rect w14:anchorId="15C5B1A3" id="Rectangle 1" o:spid="_x0000_s1026" style="width:451.3pt;height:.1pt;visibility:visible;mso-wrap-style:square;mso-left-percent:-10001;mso-top-percent:-10001;mso-position-horizontal:absolute;mso-position-horizontal-relative:char;mso-position-vertical:absolute;mso-position-vertical-relative:line;mso-left-percent:-10001;mso-top-percent:-10001;v-text-anchor:top" o:gfxdata="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" filled="f">
+              <v:rect w14:anchorId="15C5B1A3" id="Rectangle 1" o:spid="_x0000_s1026" style="width:451.3pt;height:.1pt;visibility:visible;mso-wrap-style:square;mso-left-percent:-10001;mso-top-percent:-10001;mso-position-horizontal:absolute;mso-position-horizontal-relative:char;mso-position-vertical:absolute;mso-position-vertical-relative:line;mso-left-percent:-10001;mso-top-percent:-10001;v-text-anchor:top" o:gfxdata="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" filled="f">
                 <w10:anchorlock/>
               </v:rect>
             </w:pict>
@@ -796,7 +796,7 @@
                   <a:graphicData uri="http://schemas.microsoft.com/office/word/2010/wordprocessingShape">
                     <wps:wsp>
                       <wps:cNvSpPr>
-                        <a:spLocks noChangeArrowheads="1"/>
+                        <a:spLocks noChangeAspect="1" noChangeArrowheads="1"/>
                       </wps:cNvSpPr>
                       <wps:spPr bwMode="auto">
                         <a:xfrm>
@@ -835,7 +835,7 @@
           </mc:Choice>
           <mc:Fallback>
             <w:pict>
-              <v:rect w14:anchorId="43CB2D87" id="Rectangle 17" o:spid="_x0000_s1026" style="width:451.3pt;height:.1pt;visibility:visible;mso-wrap-style:square;mso-left-percent:-10001;mso-top-percent:-10001;mso-position-horizontal:absolute;mso-position-horizontal-relative:char;mso-position-vertical:absolute;mso-position-vertical-relative:line;mso-left-percent:-10001;mso-top-percent:-10001;v-text-anchor:top" o:gfxdata="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" filled="f">
+              <v:rect w14:anchorId="43CB2D87" id="Rectangle 17" o:spid="_x0000_s1026" style="width:451.3pt;height:.1pt;visibility:visible;mso-wrap-style:square;mso-left-percent:-10001;mso-top-percent:-10001;mso-position-horizontal:absolute;mso-position-horizontal-relative:char;mso-position-vertical:absolute;mso-position-vertical-relative:line;mso-left-percent:-10001;mso-top-percent:-10001;v-text-anchor:top" o:gfxdata="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" filled="f">
                 <w10:anchorlock/>
               </v:rect>
             </w:pict>
@@ -992,7 +992,7 @@
                   <a:graphicData uri="http://schemas.microsoft.com/office/word/2010/wordprocessingShape">
                     <wps:wsp>
                       <wps:cNvSpPr>
-                        <a:spLocks noChangeArrowheads="1"/>
+                        <a:spLocks noChangeAspect="1" noChangeArrowheads="1"/>
                       </wps:cNvSpPr>
                       <wps:spPr bwMode="auto">
                         <a:xfrm>
@@ -1031,7 +1031,7 @@
           </mc:Choice>
           <mc:Fallback>
             <w:pict>
-              <v:rect w14:anchorId="7B2470AA" id="Rectangle 16" o:spid="_x0000_s1026" style="width:451.3pt;height:.1pt;visibility:visible;mso-wrap-style:square;mso-left-percent:-10001;mso-top-percent:-10001;mso-position-horizontal:absolute;mso-position-horizontal-relative:char;mso-position-vertical:absolute;mso-position-vertical-relative:line;mso-left-percent:-10001;mso-top-percent:-10001;v-text-anchor:top" o:gfxdata="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" filled="f">
+              <v:rect w14:anchorId="7B2470AA" id="Rectangle 16" o:spid="_x0000_s1026" style="width:451.3pt;height:.1pt;visibility:visible;mso-wrap-style:square;mso-left-percent:-10001;mso-top-percent:-10001;mso-position-horizontal:absolute;mso-position-horizontal-relative:char;mso-position-vertical:absolute;mso-position-vertical-relative:line;mso-left-percent:-10001;mso-top-percent:-10001;v-text-anchor:top" o:gfxdata="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" filled="f">
                 <w10:anchorlock/>
               </v:rect>
             </w:pict>
@@ -1301,7 +1301,7 @@
                   <a:graphicData uri="http://schemas.microsoft.com/office/word/2010/wordprocessingShape">
                     <wps:wsp>
                       <wps:cNvSpPr>
-                        <a:spLocks noChangeArrowheads="1"/>
+                        <a:spLocks noChangeAspect="1" noChangeArrowheads="1"/>
                       </wps:cNvSpPr>
                       <wps:spPr bwMode="auto">
                         <a:xfrm>
@@ -1340,7 +1340,7 @@
           </mc:Choice>
           <mc:Fallback>
             <w:pict>
-              <v:rect w14:anchorId="28644C36" id="Rectangle 15" o:spid="_x0000_s1026" style="width:451.3pt;height:.1pt;visibility:visible;mso-wrap-style:square;mso-left-percent:-10001;mso-top-percent:-10001;mso-position-horizontal:absolute;mso-position-horizontal-relative:char;mso-position-vertical:absolute;mso-position-vertical-relative:line;mso-left-percent:-10001;mso-top-percent:-10001;v-text-anchor:top" o:gfxdata="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" filled="f">
+              <v:rect w14:anchorId="28644C36" id="Rectangle 15" o:spid="_x0000_s1026" style="width:451.3pt;height:.1pt;visibility:visible;mso-wrap-style:square;mso-left-percent:-10001;mso-top-percent:-10001;mso-position-horizontal:absolute;mso-position-horizontal-relative:char;mso-position-vertical:absolute;mso-position-vertical-relative:line;mso-left-percent:-10001;mso-top-percent:-10001;v-text-anchor:top" o:gfxdata="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" filled="f">
                 <w10:anchorlock/>
               </v:rect>
             </w:pict>
@@ -1497,7 +1497,7 @@
                   <a:graphicData uri="http://schemas.microsoft.com/office/word/2010/wordprocessingShape">
                     <wps:wsp>
                       <wps:cNvSpPr>
-                        <a:spLocks noChangeArrowheads="1"/>
+                        <a:spLocks noChangeAspect="1" noChangeArrowheads="1"/>
                       </wps:cNvSpPr>
                       <wps:spPr bwMode="auto">
                         <a:xfrm>
@@ -1536,7 +1536,7 @@
           </mc:Choice>
           <mc:Fallback>
             <w:pict>
-              <v:rect w14:anchorId="22B08B99" id="Rectangle 14" o:spid="_x0000_s1026" style="width:451.3pt;height:.1pt;visibility:visible;mso-wrap-style:square;mso-left-percent:-10001;mso-top-percent:-10001;mso-position-horizontal:absolute;mso-position-horizontal-relative:char;mso-position-vertical:absolute;mso-position-vertical-relative:line;mso-left-percent:-10001;mso-top-percent:-10001;v-text-anchor:top" o:gfxdata="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" filled="f">
+              <v:rect w14:anchorId="22B08B99" id="Rectangle 14" o:spid="_x0000_s1026" style="width:451.3pt;height:.1pt;visibility:visible;mso-wrap-style:square;mso-left-percent:-10001;mso-top-percent:-10001;mso-position-horizontal:absolute;mso-position-horizontal-relative:char;mso-position-vertical:absolute;mso-position-vertical-relative:line;mso-left-percent:-10001;mso-top-percent:-10001;v-text-anchor:top" o:gfxdata="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" filled="f">
                 <w10:anchorlock/>
               </v:rect>
             </w:pict>
@@ -1832,7 +1832,7 @@
                   <a:graphicData uri="http://schemas.microsoft.com/office/word/2010/wordprocessingShape">
                     <wps:wsp>
                       <wps:cNvSpPr>
-                        <a:spLocks noChangeArrowheads="1"/>
+                        <a:spLocks noChangeAspect="1" noChangeArrowheads="1"/>
                       </wps:cNvSpPr>
                       <wps:spPr bwMode="auto">
                         <a:xfrm>
@@ -1871,7 +1871,7 @@
           </mc:Choice>
           <mc:Fallback>
             <w:pict>
-              <v:rect w14:anchorId="2BBB6D7A" id="Rectangle 12" o:spid="_x0000_s1026" style="width:451.3pt;height:.1pt;visibility:visible;mso-wrap-style:square;mso-left-percent:-10001;mso-top-percent:-10001;mso-position-horizontal:absolute;mso-position-horizontal-relative:char;mso-position-vertical:absolute;mso-position-vertical-relative:line;mso-left-percent:-10001;mso-top-percent:-10001;v-text-anchor:top" o:gfxdata="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" filled="f">
+              <v:rect w14:anchorId="2BBB6D7A" id="Rectangle 12" o:spid="_x0000_s1026" style="width:451.3pt;height:.1pt;visibility:visible;mso-wrap-style:square;mso-left-percent:-10001;mso-top-percent:-10001;mso-position-horizontal:absolute;mso-position-horizontal-relative:char;mso-position-vertical:absolute;mso-position-vertical-relative:line;mso-left-percent:-10001;mso-top-percent:-10001;v-text-anchor:top" o:gfxdata="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" filled="f">
                 <w10:anchorlock/>
               </v:rect>
             </w:pict>
@@ -2028,7 +2028,7 @@
                   <a:graphicData uri="http://schemas.microsoft.com/office/word/2010/wordprocessingShape">
                     <wps:wsp>
                       <wps:cNvSpPr>
-                        <a:spLocks noChangeArrowheads="1"/>
+                        <a:spLocks noChangeAspect="1" noChangeArrowheads="1"/>
                       </wps:cNvSpPr>
                       <wps:spPr bwMode="auto">
                         <a:xfrm>
@@ -2067,7 +2067,7 @@
           </mc:Choice>
           <mc:Fallback>
             <w:pict>
-              <v:rect w14:anchorId="7A98C50E" id="Rectangle 11" o:spid="_x0000_s1026" style="width:451.3pt;height:.1pt;visibility:visible;mso-wrap-style:square;mso-left-percent:-10001;mso-top-percent:-10001;mso-position-horizontal:absolute;mso-position-horizontal-relative:char;mso-position-vertical:absolute;mso-position-vertical-relative:line;mso-left-percent:-10001;mso-top-percent:-10001;v-text-anchor:top" o:gfxdata="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" filled="f">
+              <v:rect w14:anchorId="7A98C50E" id="Rectangle 11" o:spid="_x0000_s1026" style="width:451.3pt;height:.1pt;visibility:visible;mso-wrap-style:square;mso-left-percent:-10001;mso-top-percent:-10001;mso-position-horizontal:absolute;mso-position-horizontal-relative:char;mso-position-vertical:absolute;mso-position-vertical-relative:line;mso-left-percent:-10001;mso-top-percent:-10001;v-text-anchor:top" o:gfxdata="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" filled="f">
                 <w10:anchorlock/>
               </v:rect>
             </w:pict>
@@ -2224,7 +2224,7 @@
                   <a:graphicData uri="http://schemas.microsoft.com/office/word/2010/wordprocessingShape">
                     <wps:wsp>
                       <wps:cNvSpPr>
-                        <a:spLocks noChangeArrowheads="1"/>
+                        <a:spLocks noChangeAspect="1" noChangeArrowheads="1"/>
                       </wps:cNvSpPr>
                       <wps:spPr bwMode="auto">
                         <a:xfrm>
@@ -2263,7 +2263,7 @@
           </mc:Choice>
           <mc:Fallback>
             <w:pict>
-              <v:rect w14:anchorId="0FB674C1" id="Rectangle 10" o:spid="_x0000_s1026" style="width:451.3pt;height:.1pt;visibility:visible;mso-wrap-style:square;mso-left-percent:-10001;mso-top-percent:-10001;mso-position-horizontal:absolute;mso-position-horizontal-relative:char;mso-position-vertical:absolute;mso-position-vertical-relative:line;mso-left-percent:-10001;mso-top-percent:-10001;v-text-anchor:top" o:gfxdata="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" filled="f">
+              <v:rect w14:anchorId="0FB674C1" id="Rectangle 10" o:spid="_x0000_s1026" style="width:451.3pt;height:.1pt;visibility:visible;mso-wrap-style:square;mso-left-percent:-10001;mso-top-percent:-10001;mso-position-horizontal:absolute;mso-position-horizontal-relative:char;mso-position-vertical:absolute;mso-position-vertical-relative:line;mso-left-percent:-10001;mso-top-percent:-10001;v-text-anchor:top" o:gfxdata="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" filled="f">
                 <w10:anchorlock/>
               </v:rect>
             </w:pict>
@@ -2392,7 +2392,7 @@
                   <a:graphicData uri="http://schemas.microsoft.com/office/word/2010/wordprocessingShape">
                     <wps:wsp>
                       <wps:cNvSpPr>
-                        <a:spLocks noChangeArrowheads="1"/>
+                        <a:spLocks noChangeAspect="1" noChangeArrowheads="1"/>
                       </wps:cNvSpPr>
                       <wps:spPr bwMode="auto">
                         <a:xfrm>
@@ -2431,7 +2431,7 @@
           </mc:Choice>
           <mc:Fallback>
             <w:pict>
-              <v:rect w14:anchorId="16FE7754" id="Rectangle 9" o:spid="_x0000_s1026" style="width:451.3pt;height:.1pt;visibility:visible;mso-wrap-style:square;mso-left-percent:-10001;mso-top-percent:-10001;mso-position-horizontal:absolute;mso-position-horizontal-relative:char;mso-position-vertical:absolute;mso-position-vertical-relative:line;mso-left-percent:-10001;mso-top-percent:-10001;v-text-anchor:top" o:gfxdata="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" filled="f">
+              <v:rect w14:anchorId="16FE7754" id="Rectangle 9" o:spid="_x0000_s1026" style="width:451.3pt;height:.1pt;visibility:visible;mso-wrap-style:square;mso-left-percent:-10001;mso-top-percent:-10001;mso-position-horizontal:absolute;mso-position-horizontal-relative:char;mso-position-vertical:absolute;mso-position-vertical-relative:line;mso-left-percent:-10001;mso-top-percent:-10001;v-text-anchor:top" o:gfxdata="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" filled="f">
                 <w10:anchorlock/>
               </v:rect>
             </w:pict>
@@ -2635,7 +2635,7 @@
                   <a:graphicData uri="http://schemas.microsoft.com/office/word/2010/wordprocessingShape">
                     <wps:wsp>
                       <wps:cNvSpPr>
-                        <a:spLocks noChangeArrowheads="1"/>
+                        <a:spLocks noChangeAspect="1" noChangeArrowheads="1"/>
                       </wps:cNvSpPr>
                       <wps:spPr bwMode="auto">
                         <a:xfrm>
@@ -2674,7 +2674,7 @@
           </mc:Choice>
           <mc:Fallback>
             <w:pict>
-              <v:rect w14:anchorId="4302DEEA" id="Rectangle 8" o:spid="_x0000_s1026" style="width:451.3pt;height:.1pt;visibility:visible;mso-wrap-style:square;mso-left-percent:-10001;mso-top-percent:-10001;mso-position-horizontal:absolute;mso-position-horizontal-relative:char;mso-position-vertical:absolute;mso-position-vertical-relative:line;mso-left-percent:-10001;mso-top-percent:-10001;v-text-anchor:top" o:gfxdata="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" filled="f">
+              <v:rect w14:anchorId="4302DEEA" id="Rectangle 8" o:spid="_x0000_s1026" style="width:451.3pt;height:.1pt;visibility:visible;mso-wrap-style:square;mso-left-percent:-10001;mso-top-percent:-10001;mso-position-horizontal:absolute;mso-position-horizontal-relative:char;mso-position-vertical:absolute;mso-position-vertical-relative:line;mso-left-percent:-10001;mso-top-percent:-10001;v-text-anchor:top" o:gfxdata="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" filled="f">
                 <w10:anchorlock/>
               </v:rect>
             </w:pict>
@@ -2893,7 +2893,7 @@
                   <a:graphicData uri="http://schemas.microsoft.com/office/word/2010/wordprocessingShape">
                     <wps:wsp>
                       <wps:cNvSpPr>
-                        <a:spLocks noChangeArrowheads="1"/>
+                        <a:spLocks noChangeAspect="1" noChangeArrowheads="1"/>
                       </wps:cNvSpPr>
                       <wps:spPr bwMode="auto">
                         <a:xfrm>
@@ -2932,7 +2932,7 @@
           </mc:Choice>
           <mc:Fallback>
             <w:pict>
-              <v:rect w14:anchorId="35FE1CAB" id="Rectangle 6" o:spid="_x0000_s1026" style="width:451.3pt;height:.1pt;visibility:visible;mso-wrap-style:square;mso-left-percent:-10001;mso-top-percent:-10001;mso-position-horizontal:absolute;mso-position-horizontal-relative:char;mso-position-vertical:absolute;mso-position-vertical-relative:line;mso-left-percent:-10001;mso-top-percent:-10001;v-text-anchor:top" o:gfxdata="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" filled="f">
+              <v:rect w14:anchorId="35FE1CAB" id="Rectangle 6" o:spid="_x0000_s1026" style="width:451.3pt;height:.1pt;visibility:visible;mso-wrap-style:square;mso-left-percent:-10001;mso-top-percent:-10001;mso-position-horizontal:absolute;mso-position-horizontal-relative:char;mso-position-vertical:absolute;mso-position-vertical-relative:line;mso-left-percent:-10001;mso-top-percent:-10001;v-text-anchor:top" o:gfxdata="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" filled="f">
                 <w10:anchorlock/>
               </v:rect>
             </w:pict>
@@ -2994,31 +2994,7 @@
           <w:lang w:val="en-IN" w:eastAsia="en-GB"/>
           <w14:ligatures w14:val="none"/>
         </w:rPr>
-        <w:t xml:space="preserve">Students must maintain respectful </w:t>
-      </w:r>
-      <w:proofErr w:type="spellStart"/>
-      <w:r>
-        <w:rPr>
-          <w:rFonts w:ascii="Times New Roman" w:eastAsiaTheme="minorEastAsia" w:hAnsi="Times New Roman" w:cs="Times New Roman"/>
-          <w:kern w:val="0"/>
-          <w:sz w:val="24"/>
-          <w:szCs w:val="24"/>
-          <w:lang w:val="en-IN" w:eastAsia="en-GB"/>
-          <w14:ligatures w14:val="none"/>
-        </w:rPr>
-        <w:t>behavior</w:t>
-      </w:r>
-      <w:proofErr w:type="spellEnd"/>
-      <w:r>
-        <w:rPr>
-          <w:rFonts w:ascii="Times New Roman" w:eastAsiaTheme="minorEastAsia" w:hAnsi="Times New Roman" w:cs="Times New Roman"/>
-          <w:kern w:val="0"/>
-          <w:sz w:val="24"/>
-          <w:szCs w:val="24"/>
-          <w:lang w:val="en-IN" w:eastAsia="en-GB"/>
-          <w14:ligatures w14:val="none"/>
-        </w:rPr>
-        <w:t xml:space="preserve"> with:</w:t>
+        <w:t>Students must maintain respectful behavior with:</w:t>
       </w:r>
     </w:p>
     <w:p>
@@ -3193,7 +3169,7 @@
                   <a:graphicData uri="http://schemas.microsoft.com/office/word/2010/wordprocessingShape">
                     <wps:wsp>
                       <wps:cNvSpPr>
-                        <a:spLocks noChangeArrowheads="1"/>
+                        <a:spLocks noChangeAspect="1" noChangeArrowheads="1"/>
                       </wps:cNvSpPr>
                       <wps:spPr bwMode="auto">
                         <a:xfrm>
@@ -3232,7 +3208,7 @@
           </mc:Choice>
           <mc:Fallback>
             <w:pict>
-              <v:rect w14:anchorId="689B8CD4" id="Rectangle 5" o:spid="_x0000_s1026" style="width:451.3pt;height:.1pt;visibility:visible;mso-wrap-style:square;mso-left-percent:-10001;mso-top-percent:-10001;mso-position-horizontal:absolute;mso-position-horizontal-relative:char;mso-position-vertical:absolute;mso-position-vertical-relative:line;mso-left-percent:-10001;mso-top-percent:-10001;v-text-anchor:top" o:gfxdata="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" filled="f">
+              <v:rect w14:anchorId="689B8CD4" id="Rectangle 5" o:spid="_x0000_s1026" style="width:451.3pt;height:.1pt;visibility:visible;mso-wrap-style:square;mso-left-percent:-10001;mso-top-percent:-10001;mso-position-horizontal:absolute;mso-position-horizontal-relative:char;mso-position-vertical:absolute;mso-position-vertical-relative:line;mso-left-percent:-10001;mso-top-percent:-10001;v-text-anchor:top" o:gfxdata="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" filled="f">
                 <w10:anchorlock/>
               </v:rect>
             </w:pict>
@@ -3361,7 +3337,7 @@
                   <a:graphicData uri="http://schemas.microsoft.com/office/word/2010/wordprocessingShape">
                     <wps:wsp>
                       <wps:cNvSpPr>
-                        <a:spLocks noChangeArrowheads="1"/>
+                        <a:spLocks noChangeAspect="1" noChangeArrowheads="1"/>
                       </wps:cNvSpPr>
                       <wps:spPr bwMode="auto">
                         <a:xfrm>
@@ -3400,7 +3376,7 @@
           </mc:Choice>
           <mc:Fallback>
             <w:pict>
-              <v:rect w14:anchorId="1036C2BF" id="Rectangle 4" o:spid="_x0000_s1026" style="width:451.3pt;height:.1pt;visibility:visible;mso-wrap-style:square;mso-left-percent:-10001;mso-top-percent:-10001;mso-position-horizontal:absolute;mso-position-horizontal-relative:char;mso-position-vertical:absolute;mso-position-vertical-relative:line;mso-left-percent:-10001;mso-top-percent:-10001;v-text-anchor:top" o:gfxdata="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" filled="f">
+              <v:rect w14:anchorId="1036C2BF" id="Rectangle 4" o:spid="_x0000_s1026" style="width:451.3pt;height:.1pt;visibility:visible;mso-wrap-style:square;mso-left-percent:-10001;mso-top-percent:-10001;mso-position-horizontal:absolute;mso-position-horizontal-relative:char;mso-position-vertical:absolute;mso-position-vertical-relative:line;mso-left-percent:-10001;mso-top-percent:-10001;v-text-anchor:top" o:gfxdata="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" filled="f">
                 <w10:anchorlock/>
               </v:rect>
             </w:pict>
@@ -3585,7 +3561,7 @@
                   <a:graphicData uri="http://schemas.microsoft.com/office/word/2010/wordprocessingShape">
                     <wps:wsp>
                       <wps:cNvSpPr>
-                        <a:spLocks noChangeArrowheads="1"/>
+                        <a:spLocks noChangeAspect="1" noChangeArrowheads="1"/>
                       </wps:cNvSpPr>
                       <wps:spPr bwMode="auto">
                         <a:xfrm>
@@ -3624,7 +3600,7 @@
           </mc:Choice>
           <mc:Fallback>
             <w:pict>
-              <v:rect w14:anchorId="597FE81C" id="Rectangle 3" o:spid="_x0000_s1026" style="width:451.3pt;height:.1pt;visibility:visible;mso-wrap-style:square;mso-left-percent:-10001;mso-top-percent:-10001;mso-position-horizontal:absolute;mso-position-horizontal-relative:char;mso-position-vertical:absolute;mso-position-vertical-relative:line;mso-left-percent:-10001;mso-top-percent:-10001;v-text-anchor:top" o:gfxdata="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" filled="f">
+              <v:rect w14:anchorId="597FE81C" id="Rectangle 3" o:spid="_x0000_s1026" style="width:451.3pt;height:.1pt;visibility:visible;mso-wrap-style:square;mso-left-percent:-10001;mso-top-percent:-10001;mso-position-horizontal:absolute;mso-position-horizontal-relative:char;mso-position-vertical:absolute;mso-position-vertical-relative:line;mso-left-percent:-10001;mso-top-percent:-10001;v-text-anchor:top" o:gfxdata="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" filled="f">
                 <w10:anchorlock/>
               </v:rect>
             </w:pict>
@@ -3725,7 +3701,7 @@
                   <a:graphicData uri="http://schemas.microsoft.com/office/word/2010/wordprocessingShape">
                     <wps:wsp>
                       <wps:cNvSpPr>
-                        <a:spLocks noChangeArrowheads="1"/>
+                        <a:spLocks noChangeAspect="1" noChangeArrowheads="1"/>
                       </wps:cNvSpPr>
                       <wps:spPr bwMode="auto">
                         <a:xfrm>
@@ -3764,7 +3740,7 @@
           </mc:Choice>
           <mc:Fallback>
             <w:pict>
-              <v:rect w14:anchorId="386469EC" id="Rectangle 2" o:spid="_x0000_s1026" style="width:451.3pt;height:.1pt;visibility:visible;mso-wrap-style:square;mso-left-percent:-10001;mso-top-percent:-10001;mso-position-horizontal:absolute;mso-position-horizontal-relative:char;mso-position-vertical:absolute;mso-position-vertical-relative:line;mso-left-percent:-10001;mso-top-percent:-10001;v-text-anchor:top" o:gfxdata="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" filled="f">
+              <v:rect w14:anchorId="386469EC" id="Rectangle 2" o:spid="_x0000_s1026" style="width:451.3pt;height:.1pt;visibility:visible;mso-wrap-style:square;mso-left-percent:-10001;mso-top-percent:-10001;mso-position-horizontal:absolute;mso-position-horizontal-relative:char;mso-position-vertical:absolute;mso-position-vertical-relative:line;mso-left-percent:-10001;mso-top-percent:-10001;v-text-anchor:top" o:gfxdata="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" filled="f">
                 <w10:anchorlock/>
               </v:rect>
             </w:pict>
@@ -3910,7 +3886,7 @@
                   <a:graphicData uri="http://schemas.microsoft.com/office/word/2010/wordprocessingShape">
                     <wps:wsp>
                       <wps:cNvSpPr>
-                        <a:spLocks noChangeArrowheads="1"/>
+                        <a:spLocks noChangeAspect="1" noChangeArrowheads="1"/>
                       </wps:cNvSpPr>
                       <wps:spPr bwMode="auto">
                         <a:xfrm>
@@ -3949,7 +3925,7 @@
           </mc:Choice>
           <mc:Fallback>
             <w:pict>
-              <v:rect w14:anchorId="0EBCBE4C" id="Rectangle 1" o:spid="_x0000_s1026" style="width:451.3pt;height:.1pt;visibility:visible;mso-wrap-style:square;mso-left-percent:-10001;mso-top-percent:-10001;mso-position-horizontal:absolute;mso-position-horizontal-relative:char;mso-position-vertical:absolute;mso-position-vertical-relative:line;mso-left-percent:-10001;mso-top-percent:-10001;v-text-anchor:top" o:gfxdata="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" filled="f">
+              <v:rect w14:anchorId="0EBCBE4C" id="Rectangle 1" o:spid="_x0000_s1026" style="width:451.3pt;height:.1pt;visibility:visible;mso-wrap-style:square;mso-left-percent:-10001;mso-top-percent:-10001;mso-position-horizontal:absolute;mso-position-horizontal-relative:char;mso-position-vertical:absolute;mso-position-vertical-relative:line;mso-left-percent:-10001;mso-top-percent:-10001;v-text-anchor:top" o:gfxdata="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" filled="f">
                 <w10:anchorlock/>
               </v:rect>
             </w:pict>
@@ -4033,15 +4009,6 @@
           <w:szCs w:val="24"/>
           <w:lang w:val="en-IN"/>
         </w:rPr>
-      </w:r>
-      <w:r>
-        <w:rPr>
-          <w:rFonts w:ascii="Times New Roman" w:hAnsi="Times New Roman" w:cs="Times New Roman"/>
-          <w:noProof/>
-          <w:sz w:val="24"/>
-          <w:szCs w:val="24"/>
-          <w:lang w:val="en-IN"/>
-        </w:rPr>
         <w:pict w14:anchorId="58397F51">
           <v:rect id="_x0000_i1025" style="width:0;height:1.5pt" o:hralign="center" o:hrstd="t" o:hr="t" fillcolor="#a0a0a0" stroked="f"/>
         </w:pict>
@@ -4099,6 +4066,8 @@
         <w:jc w:val="both"/>
         <w:rPr>
           <w:rFonts w:ascii="Times New Roman" w:hAnsi="Times New Roman" w:cs="Times New Roman"/>
+          <w:b/>
+          <w:bCs/>
           <w:sz w:val="24"/>
           <w:szCs w:val="24"/>
           <w:lang w:val="en-IN"/>
@@ -4108,56 +4077,34 @@
     <w:p>
       <w:pPr>
         <w:spacing w:line="276" w:lineRule="auto"/>
-        <w:jc w:val="both"/>
-        <w:rPr>
-          <w:rFonts w:ascii="Times New Roman" w:hAnsi="Times New Roman" w:cs="Times New Roman"/>
-          <w:sz w:val="24"/>
-          <w:szCs w:val="24"/>
-          <w:lang w:val="en-IN"/>
-        </w:rPr>
-      </w:pPr>
-      <w:r>
-        <w:rPr>
-          <w:rFonts w:ascii="Times New Roman" w:hAnsi="Times New Roman" w:cs="Times New Roman"/>
-          <w:sz w:val="24"/>
-          <w:szCs w:val="24"/>
-          <w:lang w:val="en-IN"/>
-        </w:rPr>
-        <w:t>Student Signature: _______________________</w:t>
-      </w:r>
-    </w:p>
-    <w:p>
-      <w:pPr>
-        <w:spacing w:line="276" w:lineRule="auto"/>
-        <w:jc w:val="both"/>
+        <w:jc w:val="center"/>
         <w:rPr>
           <w:rFonts w:ascii="Times New Roman" w:hAnsi="Times New Roman" w:cs="Times New Roman"/>
           <w:b/>
           <w:bCs/>
           <w:sz w:val="24"/>
           <w:szCs w:val="24"/>
+          <w:u w:val="single"/>
           <w:lang w:val="en-IN"/>
         </w:rPr>
       </w:pPr>
-    </w:p>
-    <w:p>
-      <w:pPr>
-        <w:spacing w:line="276" w:lineRule="auto"/>
-        <w:jc w:val="both"/>
+      <w:r>
         <w:rPr>
           <w:rFonts w:ascii="Times New Roman" w:hAnsi="Times New Roman" w:cs="Times New Roman"/>
           <w:b/>
           <w:bCs/>
           <w:sz w:val="24"/>
           <w:szCs w:val="24"/>
+          <w:u w:val="single"/>
           <w:lang w:val="en-IN"/>
         </w:rPr>
-      </w:pPr>
+        <w:t>Note</w:t>
+      </w:r>
     </w:p>
     <w:p>
       <w:pPr>
         <w:spacing w:line="276" w:lineRule="auto"/>
-        <w:jc w:val="both"/>
+        <w:jc w:val="center"/>
         <w:rPr>
           <w:rFonts w:ascii="Times New Roman" w:hAnsi="Times New Roman" w:cs="Times New Roman"/>
           <w:b/>
@@ -4167,518 +4114,6 @@
           <w:lang w:val="en-IN"/>
         </w:rPr>
       </w:pPr>
-    </w:p>
-    <w:p>
-      <w:pPr>
-        <w:spacing w:line="276" w:lineRule="auto"/>
-        <w:jc w:val="center"/>
-        <w:rPr>
-          <w:rFonts w:ascii="Times New Roman" w:hAnsi="Times New Roman" w:cs="Times New Roman"/>
-          <w:b/>
-          <w:bCs/>
-          <w:sz w:val="28"/>
-          <w:szCs w:val="28"/>
-          <w:u w:val="single"/>
-          <w:lang w:val="en-IN"/>
-        </w:rPr>
-      </w:pPr>
-      <w:r>
-        <w:rPr>
-          <w:rFonts w:ascii="Times New Roman" w:hAnsi="Times New Roman" w:cs="Times New Roman"/>
-          <w:b/>
-          <w:bCs/>
-          <w:sz w:val="28"/>
-          <w:szCs w:val="28"/>
-          <w:u w:val="single"/>
-          <w:lang w:val="en-IN"/>
-        </w:rPr>
-        <w:t>Fee Payment Details</w:t>
-      </w:r>
-    </w:p>
-    <w:p>
-      <w:pPr>
-        <w:spacing w:line="276" w:lineRule="auto"/>
-        <w:jc w:val="both"/>
-        <w:rPr>
-          <w:rFonts w:ascii="Times New Roman" w:hAnsi="Times New Roman" w:cs="Times New Roman"/>
-          <w:b/>
-          <w:bCs/>
-          <w:sz w:val="24"/>
-          <w:szCs w:val="24"/>
-          <w:lang w:val="en-IN"/>
-        </w:rPr>
-      </w:pPr>
-      <w:r>
-        <w:rPr>
-          <w:rFonts w:ascii="Times New Roman" w:hAnsi="Times New Roman" w:cs="Times New Roman"/>
-          <w:b/>
-          <w:bCs/>
-          <w:sz w:val="24"/>
-          <w:szCs w:val="24"/>
-          <w:lang w:val="en-IN"/>
-        </w:rPr>
-        <w:t>Name:</w:t>
-      </w:r>
-      <w:r>
-        <w:rPr>
-          <w:rFonts w:ascii="Times New Roman" w:hAnsi="Times New Roman" w:cs="Times New Roman"/>
-          <w:b/>
-          <w:bCs/>
-          <w:sz w:val="24"/>
-          <w:szCs w:val="24"/>
-          <w:lang w:val="en-IN"/>
-        </w:rPr>
-        <w:tab/>
-      </w:r>
-      <w:r>
-        <w:rPr>
-          <w:rFonts w:ascii="Times New Roman" w:hAnsi="Times New Roman" w:cs="Times New Roman"/>
-          <w:b/>
-          <w:bCs/>
-          <w:sz w:val="24"/>
-          <w:szCs w:val="24"/>
-          <w:lang w:val="en-IN"/>
-        </w:rPr>
-        <w:tab/>
-      </w:r>
-      <w:r>
-        <w:rPr>
-          <w:rFonts w:ascii="Times New Roman" w:hAnsi="Times New Roman" w:cs="Times New Roman"/>
-          <w:b/>
-          <w:bCs/>
-          <w:sz w:val="24"/>
-          <w:szCs w:val="24"/>
-          <w:lang w:val="en-IN"/>
-        </w:rPr>
-        <w:tab/>
-      </w:r>
-      <w:r>
-        <w:rPr>
-          <w:rFonts w:ascii="Times New Roman" w:hAnsi="Times New Roman" w:cs="Times New Roman"/>
-          <w:b/>
-          <w:bCs/>
-          <w:sz w:val="24"/>
-          <w:szCs w:val="24"/>
-          <w:lang w:val="en-IN"/>
-        </w:rPr>
-        <w:tab/>
-      </w:r>
-      <w:r>
-        <w:rPr>
-          <w:rFonts w:ascii="Times New Roman" w:hAnsi="Times New Roman" w:cs="Times New Roman"/>
-          <w:b/>
-          <w:bCs/>
-          <w:sz w:val="24"/>
-          <w:szCs w:val="24"/>
-          <w:lang w:val="en-IN"/>
-        </w:rPr>
-        <w:tab/>
-        <w:t>Batch Timing:</w:t>
-      </w:r>
-    </w:p>
-    <w:p>
-      <w:pPr>
-        <w:spacing w:line="276" w:lineRule="auto"/>
-        <w:jc w:val="both"/>
-        <w:rPr>
-          <w:rFonts w:ascii="Times New Roman" w:hAnsi="Times New Roman" w:cs="Times New Roman"/>
-          <w:b/>
-          <w:bCs/>
-          <w:sz w:val="24"/>
-          <w:szCs w:val="24"/>
-          <w:lang w:val="en-IN"/>
-        </w:rPr>
-      </w:pPr>
-      <w:r>
-        <w:rPr>
-          <w:rFonts w:ascii="Times New Roman" w:hAnsi="Times New Roman" w:cs="Times New Roman"/>
-          <w:b/>
-          <w:bCs/>
-          <w:sz w:val="24"/>
-          <w:szCs w:val="24"/>
-          <w:lang w:val="en-IN"/>
-        </w:rPr>
-        <w:t>Course Enrolled:</w:t>
-      </w:r>
-      <w:r>
-        <w:rPr>
-          <w:rFonts w:ascii="Times New Roman" w:hAnsi="Times New Roman" w:cs="Times New Roman"/>
-          <w:b/>
-          <w:bCs/>
-          <w:sz w:val="24"/>
-          <w:szCs w:val="24"/>
-          <w:lang w:val="en-IN"/>
-        </w:rPr>
-        <w:tab/>
-      </w:r>
-      <w:r>
-        <w:rPr>
-          <w:rFonts w:ascii="Times New Roman" w:hAnsi="Times New Roman" w:cs="Times New Roman"/>
-          <w:b/>
-          <w:bCs/>
-          <w:sz w:val="24"/>
-          <w:szCs w:val="24"/>
-          <w:lang w:val="en-IN"/>
-        </w:rPr>
-        <w:tab/>
-      </w:r>
-      <w:r>
-        <w:rPr>
-          <w:rFonts w:ascii="Times New Roman" w:hAnsi="Times New Roman" w:cs="Times New Roman"/>
-          <w:b/>
-          <w:bCs/>
-          <w:sz w:val="24"/>
-          <w:szCs w:val="24"/>
-          <w:lang w:val="en-IN"/>
-        </w:rPr>
-        <w:tab/>
-        <w:t>Batch Start Date:</w:t>
-      </w:r>
-      <w:r>
-        <w:rPr>
-          <w:rFonts w:ascii="Times New Roman" w:hAnsi="Times New Roman" w:cs="Times New Roman"/>
-          <w:b/>
-          <w:bCs/>
-          <w:sz w:val="24"/>
-          <w:szCs w:val="24"/>
-          <w:lang w:val="en-IN"/>
-        </w:rPr>
-        <w:tab/>
-      </w:r>
-      <w:r>
-        <w:rPr>
-          <w:rFonts w:ascii="Times New Roman" w:hAnsi="Times New Roman" w:cs="Times New Roman"/>
-          <w:b/>
-          <w:bCs/>
-          <w:sz w:val="24"/>
-          <w:szCs w:val="24"/>
-          <w:lang w:val="en-IN"/>
-        </w:rPr>
-        <w:tab/>
-      </w:r>
-      <w:r>
-        <w:rPr>
-          <w:rFonts w:ascii="Times New Roman" w:hAnsi="Times New Roman" w:cs="Times New Roman"/>
-          <w:b/>
-          <w:bCs/>
-          <w:sz w:val="24"/>
-          <w:szCs w:val="24"/>
-          <w:lang w:val="en-IN"/>
-        </w:rPr>
-        <w:tab/>
-        <w:t>Duration:</w:t>
-      </w:r>
-    </w:p>
-    <w:p>
-      <w:pPr>
-        <w:spacing w:line="276" w:lineRule="auto"/>
-        <w:jc w:val="both"/>
-        <w:rPr>
-          <w:rFonts w:ascii="Times New Roman" w:hAnsi="Times New Roman" w:cs="Times New Roman"/>
-          <w:b/>
-          <w:bCs/>
-          <w:sz w:val="24"/>
-          <w:szCs w:val="24"/>
-          <w:lang w:val="en-IN"/>
-        </w:rPr>
-      </w:pPr>
-      <w:r>
-        <w:rPr>
-          <w:rFonts w:ascii="Times New Roman" w:hAnsi="Times New Roman" w:cs="Times New Roman"/>
-          <w:b/>
-          <w:bCs/>
-          <w:sz w:val="24"/>
-          <w:szCs w:val="24"/>
-          <w:lang w:val="en-IN"/>
-        </w:rPr>
-        <w:t xml:space="preserve">Total Course Fee: </w:t>
-      </w:r>
-      <w:r>
-        <w:rPr>
-          <w:rFonts w:ascii="Times New Roman" w:hAnsi="Times New Roman" w:cs="Times New Roman"/>
-          <w:b/>
-          <w:bCs/>
-          <w:sz w:val="24"/>
-          <w:szCs w:val="24"/>
-          <w:lang w:val="en-IN"/>
-        </w:rPr>
-        <w:tab/>
-      </w:r>
-      <w:r>
-        <w:rPr>
-          <w:rFonts w:ascii="Times New Roman" w:hAnsi="Times New Roman" w:cs="Times New Roman"/>
-          <w:b/>
-          <w:bCs/>
-          <w:sz w:val="24"/>
-          <w:szCs w:val="24"/>
-          <w:lang w:val="en-IN"/>
-        </w:rPr>
-        <w:tab/>
-      </w:r>
-      <w:r>
-        <w:rPr>
-          <w:rFonts w:ascii="Times New Roman" w:hAnsi="Times New Roman" w:cs="Times New Roman"/>
-          <w:b/>
-          <w:bCs/>
-          <w:sz w:val="24"/>
-          <w:szCs w:val="24"/>
-          <w:lang w:val="en-IN"/>
-        </w:rPr>
-        <w:tab/>
-        <w:t>Single Shot/Instalments</w:t>
-      </w:r>
-      <w:r>
-        <w:rPr>
-          <w:rFonts w:ascii="Times New Roman" w:hAnsi="Times New Roman" w:cs="Times New Roman"/>
-          <w:b/>
-          <w:bCs/>
-          <w:sz w:val="24"/>
-          <w:szCs w:val="24"/>
-          <w:lang w:val="en-IN"/>
-        </w:rPr>
-        <w:tab/>
-        <w:t xml:space="preserve">     Cash/GPay (UPI)</w:t>
-      </w:r>
-    </w:p>
-    <w:tbl>
-      <w:tblPr>
-        <w:tblStyle w:val="TableGrid"/>
-        <w:tblW w:w="0" w:type="auto"/>
-        <w:jc w:val="center"/>
-        <w:tblLook w:val="04A0" w:firstRow="1" w:lastRow="0" w:firstColumn="1" w:lastColumn="0" w:noHBand="0" w:noVBand="1"/>
-      </w:tblPr>
-      <w:tblGrid>
-        <w:gridCol w:w="3005"/>
-        <w:gridCol w:w="3005"/>
-        <w:gridCol w:w="3006"/>
-      </w:tblGrid>
-      <w:tr>
-        <w:trPr>
-          <w:trHeight w:val="425"/>
-          <w:jc w:val="center"/>
-        </w:trPr>
-        <w:tc>
-          <w:tcPr>
-            <w:tcW w:w="3005" w:type="dxa"/>
-            <w:vAlign w:val="center"/>
-          </w:tcPr>
-          <w:p>
-            <w:pPr>
-              <w:spacing w:line="276" w:lineRule="auto"/>
-              <w:jc w:val="center"/>
-              <w:rPr>
-                <w:rFonts w:ascii="Times New Roman" w:hAnsi="Times New Roman" w:cs="Times New Roman"/>
-                <w:b/>
-                <w:bCs/>
-                <w:sz w:val="24"/>
-                <w:szCs w:val="24"/>
-                <w:lang w:val="en-IN"/>
-              </w:rPr>
-            </w:pPr>
-            <w:r>
-              <w:rPr>
-                <w:rFonts w:ascii="Times New Roman" w:hAnsi="Times New Roman" w:cs="Times New Roman"/>
-                <w:b/>
-                <w:bCs/>
-                <w:sz w:val="24"/>
-                <w:szCs w:val="24"/>
-                <w:lang w:val="en-IN"/>
-              </w:rPr>
-              <w:t>1-Installment &amp; Date</w:t>
-            </w:r>
-          </w:p>
-        </w:tc>
-        <w:tc>
-          <w:tcPr>
-            <w:tcW w:w="3005" w:type="dxa"/>
-            <w:vAlign w:val="center"/>
-          </w:tcPr>
-          <w:p>
-            <w:pPr>
-              <w:spacing w:line="276" w:lineRule="auto"/>
-              <w:jc w:val="center"/>
-              <w:rPr>
-                <w:rFonts w:ascii="Times New Roman" w:hAnsi="Times New Roman" w:cs="Times New Roman"/>
-                <w:b/>
-                <w:bCs/>
-                <w:sz w:val="24"/>
-                <w:szCs w:val="24"/>
-                <w:lang w:val="en-IN"/>
-              </w:rPr>
-            </w:pPr>
-            <w:r>
-              <w:rPr>
-                <w:rFonts w:ascii="Times New Roman" w:hAnsi="Times New Roman" w:cs="Times New Roman"/>
-                <w:b/>
-                <w:bCs/>
-                <w:sz w:val="24"/>
-                <w:szCs w:val="24"/>
-                <w:lang w:val="en-IN"/>
-              </w:rPr>
-              <w:t>2-Installment &amp; Date</w:t>
-            </w:r>
-          </w:p>
-        </w:tc>
-        <w:tc>
-          <w:tcPr>
-            <w:tcW w:w="3006" w:type="dxa"/>
-            <w:vAlign w:val="center"/>
-          </w:tcPr>
-          <w:p>
-            <w:pPr>
-              <w:spacing w:line="276" w:lineRule="auto"/>
-              <w:jc w:val="center"/>
-              <w:rPr>
-                <w:rFonts w:ascii="Times New Roman" w:hAnsi="Times New Roman" w:cs="Times New Roman"/>
-                <w:b/>
-                <w:bCs/>
-                <w:sz w:val="24"/>
-                <w:szCs w:val="24"/>
-                <w:lang w:val="en-IN"/>
-              </w:rPr>
-            </w:pPr>
-            <w:r>
-              <w:rPr>
-                <w:rFonts w:ascii="Times New Roman" w:hAnsi="Times New Roman" w:cs="Times New Roman"/>
-                <w:b/>
-                <w:bCs/>
-                <w:sz w:val="24"/>
-                <w:szCs w:val="24"/>
-                <w:lang w:val="en-IN"/>
-              </w:rPr>
-              <w:t>3-Installment &amp; Date</w:t>
-            </w:r>
-          </w:p>
-        </w:tc>
-      </w:tr>
-      <w:tr>
-        <w:trPr>
-          <w:trHeight w:val="539"/>
-          <w:jc w:val="center"/>
-        </w:trPr>
-        <w:tc>
-          <w:tcPr>
-            <w:tcW w:w="3005" w:type="dxa"/>
-            <w:vAlign w:val="center"/>
-          </w:tcPr>
-          <w:p>
-            <w:pPr>
-              <w:spacing w:line="276" w:lineRule="auto"/>
-              <w:jc w:val="center"/>
-              <w:rPr>
-                <w:rFonts w:ascii="Times New Roman" w:hAnsi="Times New Roman" w:cs="Times New Roman"/>
-                <w:b/>
-                <w:bCs/>
-                <w:sz w:val="24"/>
-                <w:szCs w:val="24"/>
-                <w:lang w:val="en-IN"/>
-              </w:rPr>
-            </w:pPr>
-          </w:p>
-        </w:tc>
-        <w:tc>
-          <w:tcPr>
-            <w:tcW w:w="3005" w:type="dxa"/>
-            <w:vAlign w:val="center"/>
-          </w:tcPr>
-          <w:p>
-            <w:pPr>
-              <w:spacing w:line="276" w:lineRule="auto"/>
-              <w:jc w:val="center"/>
-              <w:rPr>
-                <w:rFonts w:ascii="Times New Roman" w:hAnsi="Times New Roman" w:cs="Times New Roman"/>
-                <w:b/>
-                <w:bCs/>
-                <w:sz w:val="24"/>
-                <w:szCs w:val="24"/>
-                <w:lang w:val="en-IN"/>
-              </w:rPr>
-            </w:pPr>
-          </w:p>
-        </w:tc>
-        <w:tc>
-          <w:tcPr>
-            <w:tcW w:w="3006" w:type="dxa"/>
-            <w:vAlign w:val="center"/>
-          </w:tcPr>
-          <w:p>
-            <w:pPr>
-              <w:spacing w:line="276" w:lineRule="auto"/>
-              <w:jc w:val="center"/>
-              <w:rPr>
-                <w:rFonts w:ascii="Times New Roman" w:hAnsi="Times New Roman" w:cs="Times New Roman"/>
-                <w:b/>
-                <w:bCs/>
-                <w:sz w:val="24"/>
-                <w:szCs w:val="24"/>
-                <w:lang w:val="en-IN"/>
-              </w:rPr>
-            </w:pPr>
-          </w:p>
-        </w:tc>
-      </w:tr>
-    </w:tbl>
-    <w:p>
-      <w:pPr>
-        <w:spacing w:line="276" w:lineRule="auto"/>
-        <w:jc w:val="both"/>
-        <w:rPr>
-          <w:rFonts w:ascii="Times New Roman" w:hAnsi="Times New Roman" w:cs="Times New Roman"/>
-          <w:b/>
-          <w:bCs/>
-          <w:sz w:val="24"/>
-          <w:szCs w:val="24"/>
-          <w:lang w:val="en-IN"/>
-        </w:rPr>
-      </w:pPr>
-    </w:p>
-    <w:p>
-      <w:pPr>
-        <w:spacing w:line="276" w:lineRule="auto"/>
-        <w:jc w:val="both"/>
-        <w:rPr>
-          <w:rFonts w:ascii="Times New Roman" w:hAnsi="Times New Roman" w:cs="Times New Roman"/>
-          <w:b/>
-          <w:bCs/>
-          <w:sz w:val="24"/>
-          <w:szCs w:val="24"/>
-          <w:lang w:val="en-IN"/>
-        </w:rPr>
-      </w:pPr>
-      <w:r>
-        <w:rPr>
-          <w:rFonts w:ascii="Times New Roman" w:hAnsi="Times New Roman" w:cs="Times New Roman"/>
-          <w:b/>
-          <w:bCs/>
-          <w:sz w:val="24"/>
-          <w:szCs w:val="24"/>
-          <w:lang w:val="en-IN"/>
-        </w:rPr>
-        <w:t>Note:</w:t>
-      </w:r>
-    </w:p>
-    <w:p>
-      <w:pPr>
-        <w:spacing w:line="276" w:lineRule="auto"/>
-        <w:jc w:val="both"/>
-        <w:rPr>
-          <w:rFonts w:ascii="Times New Roman" w:hAnsi="Times New Roman" w:cs="Times New Roman"/>
-          <w:sz w:val="24"/>
-          <w:szCs w:val="24"/>
-          <w:lang w:val="en-IN"/>
-        </w:rPr>
-      </w:pPr>
-      <w:r>
-        <w:rPr>
-          <w:rFonts w:ascii="Times New Roman" w:hAnsi="Times New Roman" w:cs="Times New Roman"/>
-          <w:b/>
-          <w:bCs/>
-          <w:sz w:val="24"/>
-          <w:szCs w:val="24"/>
-          <w:lang w:val="en-IN"/>
-        </w:rPr>
-        <w:tab/>
-      </w:r>
       <w:r>
         <w:rPr>
           <w:rFonts w:ascii="Times New Roman" w:hAnsi="Times New Roman" w:cs="Times New Roman"/>
@@ -9527,7 +8962,6 @@
 <ds:datastoreItem xmlns:ds="http://schemas.openxmlformats.org/officeDocument/2006/customXml" ds:itemID="{A4AB4B0C-CCCC-410F-8C1B-25B545BF8D42}">
   <ds:schemaRefs>
     <ds:schemaRef ds:uri="http://schemas.openxmlformats.org/officeDocument/2006/bibliography"/>
-    <ds:schemaRef ds:uri="http://www.w3.org/2000/xmlns/"/>
   </ds:schemaRefs>
 </ds:datastoreItem>
 </file>
</xml_diff>